<commit_message>
Feat: proteccion y ofuscacion de codigo fuente con JavaScript Obfuscator (Compact, StringArray RC4, ControlFlowFlattening y RenameGlobals)
</commit_message>
<xml_diff>
--- a/Prompt solicitud 26827.docx
+++ b/Prompt solicitud 26827.docx
@@ -30,125 +30,364 @@
     </w:p>
     <w:p>
       <w:pPr>
+        <w:pStyle w:val="NormalWeb"/>
+        <w:rPr>
+          <w:lang w:val="en-US"/>
+        </w:rPr>
+      </w:pPr>
+      <w:r>
         <w:rPr>
           <w:lang w:val="es-VE"/>
         </w:rPr>
-      </w:pPr>
+        <w:t>2</w:t>
+      </w:r>
+      <w:r>
+        <w:rPr>
+          <w:rFonts w:asciiTheme="minorHAnsi" w:eastAsiaTheme="minorHAnsi" w:hAnsiTheme="minorHAnsi" w:cstheme="minorBidi"/>
+          <w:sz w:val="22"/>
+          <w:szCs w:val="22"/>
+          <w:lang w:val="es-VE" w:eastAsia="en-US"/>
+        </w:rPr>
+        <w:t>.-</w:t>
+      </w:r>
+      <w:r>
+        <w:rPr>
+          <w:rFonts w:asciiTheme="minorHAnsi" w:eastAsiaTheme="minorHAnsi" w:hAnsiTheme="minorHAnsi" w:cstheme="minorBidi"/>
+          <w:sz w:val="22"/>
+          <w:szCs w:val="22"/>
+          <w:lang w:val="es-VE" w:eastAsia="en-US"/>
+        </w:rPr>
+        <w:t xml:space="preserve"> Proteger mediante </w:t>
+      </w:r>
+      <w:r>
+        <w:rPr>
+          <w:rFonts w:asciiTheme="minorHAnsi" w:eastAsiaTheme="minorHAnsi" w:hAnsiTheme="minorHAnsi" w:cstheme="minorBidi"/>
+          <w:sz w:val="22"/>
+          <w:szCs w:val="22"/>
+          <w:lang w:val="es-VE" w:eastAsia="en-US"/>
+        </w:rPr>
+        <w:t>Ofuscación de código la app</w:t>
+      </w:r>
       <w:r>
         <w:rPr>
           <w:lang w:val="es-VE"/>
         </w:rPr>
-        <w:t>2</w:t>
-      </w:r>
-      <w:r>
-        <w:rPr>
+        <w:t xml:space="preserve"> mediante </w:t>
+      </w:r>
+      <w:r>
+        <w:rPr>
+          <w:rFonts w:asciiTheme="minorHAnsi" w:hAnsiTheme="minorHAnsi" w:cstheme="minorBidi"/>
+          <w:sz w:val="22"/>
+          <w:szCs w:val="22"/>
           <w:lang w:val="es-VE"/>
         </w:rPr>
-        <w:t xml:space="preserve">.- Al </w:t>
-      </w:r>
-      <w:r>
-        <w:rPr>
+        <w:t xml:space="preserve">JavaScript </w:t>
+      </w:r>
+      <w:proofErr w:type="spellStart"/>
+      <w:r>
+        <w:rPr>
+          <w:rFonts w:asciiTheme="minorHAnsi" w:hAnsiTheme="minorHAnsi" w:cstheme="minorBidi"/>
+          <w:sz w:val="22"/>
+          <w:szCs w:val="22"/>
           <w:lang w:val="es-VE"/>
         </w:rPr>
-        <w:t xml:space="preserve">Definir Unidad </w:t>
-      </w:r>
+        <w:t>Obfuscator</w:t>
+      </w:r>
+      <w:proofErr w:type="spellEnd"/>
       <w:r>
         <w:rPr>
           <w:lang w:val="es-VE"/>
         </w:rPr>
-        <w:t>Objetivo:</w:t>
-      </w:r>
-      <w:r>
-        <w:rPr>
-          <w:lang w:val="es-VE"/>
-        </w:rPr>
-        <w:t xml:space="preserve"> La app debe validar (Chequear) si esta selección es </w:t>
+        <w:t xml:space="preserve">. </w:t>
       </w:r>
       <w:proofErr w:type="spellStart"/>
-      <w:r>
-        <w:rPr>
-          <w:lang w:val="es-VE"/>
-        </w:rPr>
-        <w:t>compoatible</w:t>
+      <w:proofErr w:type="gramStart"/>
+      <w:r>
+        <w:rPr>
+          <w:lang w:val="en-US"/>
+        </w:rPr>
+        <w:t>Usar</w:t>
       </w:r>
       <w:proofErr w:type="spellEnd"/>
       <w:r>
         <w:rPr>
-          <w:lang w:val="es-VE"/>
-        </w:rPr>
-        <w:t xml:space="preserve"> con  las unidades disponibles en el Box. En caso de ser Negativo, mostrar un mensaje de error</w:t>
+          <w:lang w:val="en-US"/>
+        </w:rPr>
+        <w:t xml:space="preserve"> </w:t>
+      </w:r>
+      <w:r>
+        <w:rPr>
+          <w:rFonts w:hAnsi="Symbol"/>
+          <w:lang w:val="en-US"/>
+        </w:rPr>
+        <w:t>:</w:t>
+      </w:r>
+      <w:proofErr w:type="gramEnd"/>
+      <w:r>
+        <w:rPr>
+          <w:rFonts w:hAnsi="Symbol"/>
+          <w:lang w:val="en-US"/>
+        </w:rPr>
+        <w:t xml:space="preserve"> </w:t>
+      </w:r>
+      <w:bookmarkStart w:id="0" w:name="_GoBack"/>
+      <w:bookmarkEnd w:id="0"/>
+      <w:r>
+        <w:rPr>
+          <w:rStyle w:val="CdigoHTML"/>
+          <w:b/>
+          <w:bCs/>
+          <w:lang w:val="en-US"/>
+        </w:rPr>
+        <w:t>Compact</w:t>
+      </w:r>
+      <w:r>
+        <w:rPr>
+          <w:b/>
+          <w:bCs/>
+          <w:lang w:val="en-US"/>
+        </w:rPr>
+        <w:t>:</w:t>
+      </w:r>
+      <w:r>
+        <w:rPr>
+          <w:lang w:val="en-US"/>
+        </w:rPr>
+        <w:t xml:space="preserve"> </w:t>
+      </w:r>
+      <w:r>
+        <w:rPr>
+          <w:rStyle w:val="CdigoHTML"/>
+          <w:lang w:val="en-US"/>
+        </w:rPr>
+        <w:t>true</w:t>
+      </w:r>
+      <w:r>
+        <w:rPr>
+          <w:lang w:val="en-US"/>
+        </w:rPr>
+        <w:t xml:space="preserve"> </w:t>
+      </w:r>
+      <w:r>
+        <w:rPr>
+          <w:lang w:val="en-US"/>
+        </w:rPr>
+        <w:t>,</w:t>
+      </w:r>
+      <w:r>
+        <w:rPr>
+          <w:lang w:val="en-US"/>
+        </w:rPr>
+        <w:t xml:space="preserve">  </w:t>
+      </w:r>
+      <w:r>
+        <w:rPr>
+          <w:rStyle w:val="CdigoHTML"/>
+          <w:b/>
+          <w:bCs/>
+          <w:lang w:val="en-US"/>
+        </w:rPr>
+        <w:t>String Array</w:t>
+      </w:r>
+      <w:r>
+        <w:rPr>
+          <w:b/>
+          <w:bCs/>
+          <w:lang w:val="en-US"/>
+        </w:rPr>
+        <w:t>:</w:t>
+      </w:r>
+      <w:r>
+        <w:rPr>
+          <w:lang w:val="en-US"/>
+        </w:rPr>
+        <w:t xml:space="preserve"> </w:t>
+      </w:r>
+      <w:r>
+        <w:rPr>
+          <w:rStyle w:val="CdigoHTML"/>
+          <w:lang w:val="en-US"/>
+        </w:rPr>
+        <w:t>true</w:t>
+      </w:r>
+      <w:r>
+        <w:rPr>
+          <w:lang w:val="en-US"/>
+        </w:rPr>
+        <w:t xml:space="preserve"> </w:t>
+      </w:r>
+      <w:r>
+        <w:rPr>
+          <w:lang w:val="en-US"/>
+        </w:rPr>
+        <w:t>, s</w:t>
+      </w:r>
+      <w:r>
+        <w:rPr>
+          <w:rStyle w:val="CdigoHTML"/>
+          <w:b/>
+          <w:bCs/>
+          <w:lang w:val="en-US"/>
+        </w:rPr>
+        <w:t>tring Array Encoding</w:t>
+      </w:r>
+      <w:r>
+        <w:rPr>
+          <w:b/>
+          <w:bCs/>
+          <w:lang w:val="en-US"/>
+        </w:rPr>
+        <w:t>:</w:t>
+      </w:r>
+      <w:r>
+        <w:rPr>
+          <w:lang w:val="en-US"/>
+        </w:rPr>
+        <w:t xml:space="preserve"> </w:t>
+      </w:r>
+      <w:r>
+        <w:rPr>
+          <w:rStyle w:val="CdigoHTML"/>
+          <w:lang w:val="en-US"/>
+        </w:rPr>
+        <w:t>['</w:t>
+      </w:r>
+      <w:r>
+        <w:rPr>
+          <w:rStyle w:val="CdigoHTML"/>
+          <w:lang w:val="en-US"/>
+        </w:rPr>
+        <w:t>rc4</w:t>
+      </w:r>
+      <w:r>
+        <w:rPr>
+          <w:rStyle w:val="CdigoHTML"/>
+          <w:lang w:val="en-US"/>
+        </w:rPr>
+        <w:t>']</w:t>
+      </w:r>
+      <w:r>
+        <w:rPr>
+          <w:lang w:val="en-US"/>
+        </w:rPr>
+        <w:t xml:space="preserve"> </w:t>
+      </w:r>
+      <w:r>
+        <w:rPr>
+          <w:lang w:val="en-US"/>
+        </w:rPr>
+        <w:t xml:space="preserve">, </w:t>
+      </w:r>
+      <w:r>
+        <w:rPr>
+          <w:rStyle w:val="CdigoHTML"/>
+          <w:b/>
+          <w:bCs/>
+          <w:lang w:val="en-US"/>
+        </w:rPr>
+        <w:t>Control Flow Flattening</w:t>
+      </w:r>
+      <w:r>
+        <w:rPr>
+          <w:b/>
+          <w:bCs/>
+          <w:lang w:val="en-US"/>
+        </w:rPr>
+        <w:t>:</w:t>
+      </w:r>
+      <w:r>
+        <w:rPr>
+          <w:lang w:val="en-US"/>
+        </w:rPr>
+        <w:t xml:space="preserve"> </w:t>
+      </w:r>
+      <w:r>
+        <w:rPr>
+          <w:rStyle w:val="CdigoHTML"/>
+          <w:lang w:val="en-US"/>
+        </w:rPr>
+        <w:t>true</w:t>
+      </w:r>
+      <w:r>
+        <w:rPr>
+          <w:lang w:val="en-US"/>
+        </w:rPr>
+        <w:t xml:space="preserve"> </w:t>
+      </w:r>
+      <w:r>
+        <w:rPr>
+          <w:lang w:val="en-US"/>
+        </w:rPr>
+        <w:t>,</w:t>
+      </w:r>
+      <w:r>
+        <w:rPr>
+          <w:lang w:val="en-US"/>
+        </w:rPr>
+        <w:t xml:space="preserve">  </w:t>
+      </w:r>
+      <w:r>
+        <w:rPr>
+          <w:rStyle w:val="CdigoHTML"/>
+          <w:b/>
+          <w:bCs/>
+          <w:lang w:val="en-US"/>
+        </w:rPr>
+        <w:t xml:space="preserve">Rename </w:t>
+      </w:r>
+      <w:proofErr w:type="spellStart"/>
+      <w:r>
+        <w:rPr>
+          <w:rStyle w:val="CdigoHTML"/>
+          <w:b/>
+          <w:bCs/>
+          <w:lang w:val="en-US"/>
+        </w:rPr>
+        <w:t>Globals</w:t>
+      </w:r>
+      <w:proofErr w:type="spellEnd"/>
+      <w:r>
+        <w:rPr>
+          <w:b/>
+          <w:bCs/>
+          <w:lang w:val="en-US"/>
+        </w:rPr>
+        <w:t>:</w:t>
+      </w:r>
+      <w:r>
+        <w:rPr>
+          <w:lang w:val="en-US"/>
+        </w:rPr>
+        <w:t xml:space="preserve"> </w:t>
+      </w:r>
+      <w:r>
+        <w:rPr>
+          <w:rStyle w:val="CdigoHTML"/>
+          <w:lang w:val="en-US"/>
+        </w:rPr>
+        <w:t>true</w:t>
       </w:r>
     </w:p>
     <w:p>
       <w:pPr>
         <w:rPr>
-          <w:lang w:val="es-VE"/>
+          <w:lang w:val="en-US"/>
         </w:rPr>
       </w:pPr>
     </w:p>
     <w:p>
       <w:pPr>
         <w:rPr>
-          <w:lang w:val="es-VE"/>
-        </w:rPr>
-      </w:pPr>
-      <w:r>
-        <w:rPr>
-          <w:lang w:val="es-VE"/>
-        </w:rPr>
-        <w:t>3</w:t>
-      </w:r>
-      <w:r>
-        <w:rPr>
-          <w:lang w:val="es-VE"/>
-        </w:rPr>
-        <w:t xml:space="preserve">.- En el </w:t>
-      </w:r>
-      <w:r>
-        <w:rPr>
-          <w:lang w:val="es-VE"/>
-        </w:rPr>
-        <w:t xml:space="preserve"> </w:t>
-      </w:r>
-      <w:r>
-        <w:rPr>
-          <w:lang w:val="es-VE"/>
-        </w:rPr>
-        <w:t xml:space="preserve">“Centro de Entrenamiento”, </w:t>
-      </w:r>
-      <w:r>
-        <w:rPr>
-          <w:lang w:val="es-VE"/>
-        </w:rPr>
-        <w:t>eliminar la barra vertical que aparece en esta</w:t>
-      </w:r>
+          <w:lang w:val="en-US"/>
+        </w:rPr>
+      </w:pPr>
     </w:p>
     <w:p>
       <w:pPr>
         <w:rPr>
-          <w:lang w:val="es-VE"/>
-        </w:rPr>
-      </w:pPr>
-      <w:r>
-        <w:rPr>
-          <w:lang w:val="es-VE"/>
-        </w:rPr>
-        <w:t>4</w:t>
-      </w:r>
-      <w:r>
-        <w:rPr>
-          <w:lang w:val="es-VE"/>
-        </w:rPr>
-        <w:t>- Ca</w:t>
-      </w:r>
-      <w:bookmarkStart w:id="0" w:name="_GoBack"/>
-      <w:bookmarkEnd w:id="0"/>
-      <w:r>
-        <w:rPr>
-          <w:lang w:val="es-VE"/>
-        </w:rPr>
-        <w:t>mbiar la Versión de la App de 2626 a 26827</w:t>
-      </w:r>
+          <w:lang w:val="en-US"/>
+        </w:rPr>
+      </w:pPr>
     </w:p>
     <w:sectPr>
       <w:pgSz w:w="12240" w:h="15840"/>
@@ -907,6 +1146,26 @@
     <w:name w:val="Normal"/>
     <w:qFormat/>
   </w:style>
+  <w:style w:type="paragraph" w:styleId="Ttulo3">
+    <w:name w:val="heading 3"/>
+    <w:basedOn w:val="Normal"/>
+    <w:link w:val="Ttulo3Car"/>
+    <w:uiPriority w:val="9"/>
+    <w:qFormat/>
+    <w:rsid w:val="009109F3"/>
+    <w:pPr>
+      <w:spacing w:before="100" w:beforeAutospacing="1" w:after="100" w:afterAutospacing="1" w:line="240" w:lineRule="auto"/>
+      <w:outlineLvl w:val="2"/>
+    </w:pPr>
+    <w:rPr>
+      <w:rFonts w:ascii="Times New Roman" w:eastAsia="Times New Roman" w:hAnsi="Times New Roman" w:cs="Times New Roman"/>
+      <w:b/>
+      <w:bCs/>
+      <w:sz w:val="27"/>
+      <w:szCs w:val="27"/>
+      <w:lang w:eastAsia="es-US"/>
+    </w:rPr>
+  </w:style>
   <w:style w:type="character" w:default="1" w:styleId="Fuentedeprrafopredeter">
     <w:name w:val="Default Paragraph Font"/>
     <w:uiPriority w:val="1"/>
@@ -944,6 +1203,51 @@
       <w:ind w:left="720"/>
       <w:contextualSpacing/>
     </w:pPr>
+  </w:style>
+  <w:style w:type="character" w:customStyle="1" w:styleId="Ttulo3Car">
+    <w:name w:val="Título 3 Car"/>
+    <w:basedOn w:val="Fuentedeprrafopredeter"/>
+    <w:link w:val="Ttulo3"/>
+    <w:uiPriority w:val="9"/>
+    <w:rsid w:val="009109F3"/>
+    <w:rPr>
+      <w:rFonts w:ascii="Times New Roman" w:eastAsia="Times New Roman" w:hAnsi="Times New Roman" w:cs="Times New Roman"/>
+      <w:b/>
+      <w:bCs/>
+      <w:sz w:val="27"/>
+      <w:szCs w:val="27"/>
+      <w:lang w:eastAsia="es-US"/>
+    </w:rPr>
+  </w:style>
+  <w:style w:type="paragraph" w:styleId="NormalWeb">
+    <w:name w:val="Normal (Web)"/>
+    <w:basedOn w:val="Normal"/>
+    <w:uiPriority w:val="99"/>
+    <w:semiHidden/>
+    <w:unhideWhenUsed/>
+    <w:rsid w:val="00A426B9"/>
+    <w:pPr>
+      <w:spacing w:before="100" w:beforeAutospacing="1" w:after="100" w:afterAutospacing="1" w:line="240" w:lineRule="auto"/>
+    </w:pPr>
+    <w:rPr>
+      <w:rFonts w:ascii="Times New Roman" w:eastAsia="Times New Roman" w:hAnsi="Times New Roman" w:cs="Times New Roman"/>
+      <w:sz w:val="24"/>
+      <w:szCs w:val="24"/>
+      <w:lang w:eastAsia="es-US"/>
+    </w:rPr>
+  </w:style>
+  <w:style w:type="character" w:styleId="CdigoHTML">
+    <w:name w:val="HTML Code"/>
+    <w:basedOn w:val="Fuentedeprrafopredeter"/>
+    <w:uiPriority w:val="99"/>
+    <w:semiHidden/>
+    <w:unhideWhenUsed/>
+    <w:rsid w:val="00A426B9"/>
+    <w:rPr>
+      <w:rFonts w:ascii="Courier New" w:eastAsia="Times New Roman" w:hAnsi="Courier New" w:cs="Courier New"/>
+      <w:sz w:val="20"/>
+      <w:szCs w:val="20"/>
+    </w:rPr>
   </w:style>
 </w:styles>
 </file>

</xml_diff>

<commit_message>
Feat: actualizacion de version a V3.2026.09 en footer, blindaje ofuscado RC4 y sincronizacion dinamica
</commit_message>
<xml_diff>
--- a/Prompt solicitud 26827.docx
+++ b/Prompt solicitud 26827.docx
@@ -8,12 +8,6 @@
           <w:lang w:val="es-VE"/>
         </w:rPr>
       </w:pPr>
-      <w:r>
-        <w:rPr>
-          <w:lang w:val="es-VE"/>
-        </w:rPr>
-        <w:t>Quiero te comportes como un Analista Senior y modifique la App Halterofilia Pro de la siguiente Manera</w:t>
-      </w:r>
     </w:p>
     <w:p>
       <w:pPr>
@@ -25,13 +19,45 @@
         <w:rPr>
           <w:lang w:val="es-VE"/>
         </w:rPr>
-        <w:t>1.- Respetes la funcionalidad de la App tal como esta</w:t>
+        <w:t xml:space="preserve">Actúa como un Arquitecto de Software y Desarrollador Senior. Tu objetivo es </w:t>
+      </w:r>
+      <w:r>
+        <w:rPr>
+          <w:lang w:val="es-VE"/>
+        </w:rPr>
+        <w:t xml:space="preserve">modificar </w:t>
+      </w:r>
+      <w:r>
+        <w:rPr>
+          <w:lang w:val="es-VE"/>
+        </w:rPr>
+        <w:t xml:space="preserve"> la App Halterofilia Pro de la siguiente </w:t>
+      </w:r>
+      <w:r>
+        <w:rPr>
+          <w:lang w:val="es-VE"/>
+        </w:rPr>
+        <w:t>Manera:</w:t>
       </w:r>
     </w:p>
     <w:p>
       <w:pPr>
+        <w:rPr>
+          <w:lang w:val="es-VE"/>
+        </w:rPr>
+      </w:pPr>
+      <w:r>
+        <w:rPr>
+          <w:lang w:val="es-VE"/>
+        </w:rPr>
+        <w:t>1.- Respetes la funcionalidad de la App tal como esta</w:t>
+      </w:r>
+    </w:p>
+    <w:p>
+      <w:pPr>
         <w:pStyle w:val="NormalWeb"/>
         <w:rPr>
+          <w:rStyle w:val="CdigoHTML"/>
           <w:lang w:val="en-US"/>
         </w:rPr>
       </w:pPr>
@@ -130,265 +156,256 @@
         </w:rPr>
         <w:t xml:space="preserve"> </w:t>
       </w:r>
+      <w:r>
+        <w:rPr>
+          <w:rStyle w:val="CdigoHTML"/>
+          <w:b/>
+          <w:bCs/>
+          <w:lang w:val="en-US"/>
+        </w:rPr>
+        <w:t>Compact</w:t>
+      </w:r>
+      <w:r>
+        <w:rPr>
+          <w:b/>
+          <w:bCs/>
+          <w:lang w:val="en-US"/>
+        </w:rPr>
+        <w:t>:</w:t>
+      </w:r>
+      <w:r>
+        <w:rPr>
+          <w:lang w:val="en-US"/>
+        </w:rPr>
+        <w:t xml:space="preserve"> </w:t>
+      </w:r>
+      <w:r>
+        <w:rPr>
+          <w:rStyle w:val="CdigoHTML"/>
+          <w:lang w:val="en-US"/>
+        </w:rPr>
+        <w:t>true</w:t>
+      </w:r>
+      <w:r>
+        <w:rPr>
+          <w:lang w:val="en-US"/>
+        </w:rPr>
+        <w:t xml:space="preserve"> ,  </w:t>
+      </w:r>
+      <w:r>
+        <w:rPr>
+          <w:rStyle w:val="CdigoHTML"/>
+          <w:b/>
+          <w:bCs/>
+          <w:lang w:val="en-US"/>
+        </w:rPr>
+        <w:t>String Array</w:t>
+      </w:r>
+      <w:r>
+        <w:rPr>
+          <w:b/>
+          <w:bCs/>
+          <w:lang w:val="en-US"/>
+        </w:rPr>
+        <w:t>:</w:t>
+      </w:r>
+      <w:r>
+        <w:rPr>
+          <w:lang w:val="en-US"/>
+        </w:rPr>
+        <w:t xml:space="preserve"> </w:t>
+      </w:r>
+      <w:r>
+        <w:rPr>
+          <w:rStyle w:val="CdigoHTML"/>
+          <w:lang w:val="en-US"/>
+        </w:rPr>
+        <w:t>true</w:t>
+      </w:r>
+      <w:r>
+        <w:rPr>
+          <w:lang w:val="en-US"/>
+        </w:rPr>
+        <w:t xml:space="preserve"> , s</w:t>
+      </w:r>
+      <w:r>
+        <w:rPr>
+          <w:rStyle w:val="CdigoHTML"/>
+          <w:b/>
+          <w:bCs/>
+          <w:lang w:val="en-US"/>
+        </w:rPr>
+        <w:t>tring Array Encoding</w:t>
+      </w:r>
+      <w:r>
+        <w:rPr>
+          <w:b/>
+          <w:bCs/>
+          <w:lang w:val="en-US"/>
+        </w:rPr>
+        <w:t>:</w:t>
+      </w:r>
+      <w:r>
+        <w:rPr>
+          <w:lang w:val="en-US"/>
+        </w:rPr>
+        <w:t xml:space="preserve"> </w:t>
+      </w:r>
+      <w:r>
+        <w:rPr>
+          <w:rStyle w:val="CdigoHTML"/>
+          <w:lang w:val="en-US"/>
+        </w:rPr>
+        <w:t>['rc4']</w:t>
+      </w:r>
+      <w:r>
+        <w:rPr>
+          <w:lang w:val="en-US"/>
+        </w:rPr>
+        <w:t xml:space="preserve"> , </w:t>
+      </w:r>
+      <w:r>
+        <w:rPr>
+          <w:rStyle w:val="CdigoHTML"/>
+          <w:b/>
+          <w:bCs/>
+          <w:lang w:val="en-US"/>
+        </w:rPr>
+        <w:t>Control Flow Flattening</w:t>
+      </w:r>
+      <w:r>
+        <w:rPr>
+          <w:b/>
+          <w:bCs/>
+          <w:lang w:val="en-US"/>
+        </w:rPr>
+        <w:t>:</w:t>
+      </w:r>
+      <w:r>
+        <w:rPr>
+          <w:lang w:val="en-US"/>
+        </w:rPr>
+        <w:t xml:space="preserve"> </w:t>
+      </w:r>
+      <w:r>
+        <w:rPr>
+          <w:rStyle w:val="CdigoHTML"/>
+          <w:lang w:val="en-US"/>
+        </w:rPr>
+        <w:t>true</w:t>
+      </w:r>
+      <w:r>
+        <w:rPr>
+          <w:lang w:val="en-US"/>
+        </w:rPr>
+        <w:t xml:space="preserve"> ,  </w:t>
+      </w:r>
+      <w:r>
+        <w:rPr>
+          <w:rStyle w:val="CdigoHTML"/>
+          <w:b/>
+          <w:bCs/>
+          <w:lang w:val="en-US"/>
+        </w:rPr>
+        <w:t xml:space="preserve">Rename </w:t>
+      </w:r>
+      <w:proofErr w:type="spellStart"/>
+      <w:r>
+        <w:rPr>
+          <w:rStyle w:val="CdigoHTML"/>
+          <w:b/>
+          <w:bCs/>
+          <w:lang w:val="en-US"/>
+        </w:rPr>
+        <w:t>Globals</w:t>
+      </w:r>
+      <w:proofErr w:type="spellEnd"/>
+      <w:r>
+        <w:rPr>
+          <w:b/>
+          <w:bCs/>
+          <w:lang w:val="en-US"/>
+        </w:rPr>
+        <w:t>:</w:t>
+      </w:r>
+      <w:r>
+        <w:rPr>
+          <w:lang w:val="en-US"/>
+        </w:rPr>
+        <w:t xml:space="preserve"> </w:t>
+      </w:r>
+      <w:r>
+        <w:rPr>
+          <w:rStyle w:val="CdigoHTML"/>
+          <w:lang w:val="en-US"/>
+        </w:rPr>
+        <w:t>true</w:t>
+      </w:r>
+    </w:p>
+    <w:p>
+      <w:pPr>
+        <w:pStyle w:val="NormalWeb"/>
+      </w:pPr>
+      <w:r>
+        <w:rPr>
+          <w:rStyle w:val="CdigoHTML"/>
+        </w:rPr>
+        <w:t xml:space="preserve">3.- Actualizar el </w:t>
+      </w:r>
+      <w:proofErr w:type="spellStart"/>
+      <w:r>
+        <w:rPr>
+          <w:rStyle w:val="CdigoHTML"/>
+        </w:rPr>
+        <w:t>footer</w:t>
+      </w:r>
+      <w:proofErr w:type="spellEnd"/>
+      <w:r>
+        <w:rPr>
+          <w:rStyle w:val="CdigoHTML"/>
+        </w:rPr>
+        <w:t xml:space="preserve"> de la app en cuanto a la </w:t>
+      </w:r>
+      <w:proofErr w:type="spellStart"/>
+      <w:r>
+        <w:rPr>
+          <w:rStyle w:val="CdigoHTML"/>
+        </w:rPr>
+        <w:t>version</w:t>
+      </w:r>
+      <w:proofErr w:type="spellEnd"/>
+      <w:r>
+        <w:rPr>
+          <w:rStyle w:val="CdigoHTML"/>
+        </w:rPr>
+        <w:t xml:space="preserve"> de la siguiente manera </w:t>
+      </w:r>
+      <w:r>
+        <w:rPr>
+          <w:rStyle w:val="CdigoHTML"/>
+        </w:rPr>
+        <w:t>V3</w:t>
+      </w:r>
+      <w:proofErr w:type="gramStart"/>
+      <w:r>
+        <w:rPr>
+          <w:rStyle w:val="CdigoHTML"/>
+        </w:rPr>
+        <w:t>.&lt;</w:t>
+      </w:r>
+      <w:proofErr w:type="gramEnd"/>
+      <w:r>
+        <w:rPr>
+          <w:rStyle w:val="CdigoHTML"/>
+        </w:rPr>
+        <w:t>año del sistema&gt; .&lt;mes sistema&gt;</w:t>
+      </w:r>
       <w:bookmarkStart w:id="0" w:name="_GoBack"/>
       <w:bookmarkEnd w:id="0"/>
-      <w:r>
-        <w:rPr>
-          <w:rStyle w:val="CdigoHTML"/>
-          <w:b/>
-          <w:bCs/>
-          <w:lang w:val="en-US"/>
-        </w:rPr>
-        <w:t>Compact</w:t>
-      </w:r>
-      <w:r>
-        <w:rPr>
-          <w:b/>
-          <w:bCs/>
-          <w:lang w:val="en-US"/>
-        </w:rPr>
-        <w:t>:</w:t>
-      </w:r>
-      <w:r>
-        <w:rPr>
-          <w:lang w:val="en-US"/>
-        </w:rPr>
-        <w:t xml:space="preserve"> </w:t>
-      </w:r>
-      <w:r>
-        <w:rPr>
-          <w:rStyle w:val="CdigoHTML"/>
-          <w:lang w:val="en-US"/>
-        </w:rPr>
-        <w:t>true</w:t>
-      </w:r>
-      <w:r>
-        <w:rPr>
-          <w:lang w:val="en-US"/>
-        </w:rPr>
-        <w:t xml:space="preserve"> </w:t>
-      </w:r>
-      <w:r>
-        <w:rPr>
-          <w:lang w:val="en-US"/>
-        </w:rPr>
-        <w:t>,</w:t>
-      </w:r>
-      <w:r>
-        <w:rPr>
-          <w:lang w:val="en-US"/>
-        </w:rPr>
-        <w:t xml:space="preserve">  </w:t>
-      </w:r>
-      <w:r>
-        <w:rPr>
-          <w:rStyle w:val="CdigoHTML"/>
-          <w:b/>
-          <w:bCs/>
-          <w:lang w:val="en-US"/>
-        </w:rPr>
-        <w:t>String Array</w:t>
-      </w:r>
-      <w:r>
-        <w:rPr>
-          <w:b/>
-          <w:bCs/>
-          <w:lang w:val="en-US"/>
-        </w:rPr>
-        <w:t>:</w:t>
-      </w:r>
-      <w:r>
-        <w:rPr>
-          <w:lang w:val="en-US"/>
-        </w:rPr>
-        <w:t xml:space="preserve"> </w:t>
-      </w:r>
-      <w:r>
-        <w:rPr>
-          <w:rStyle w:val="CdigoHTML"/>
-          <w:lang w:val="en-US"/>
-        </w:rPr>
-        <w:t>true</w:t>
-      </w:r>
-      <w:r>
-        <w:rPr>
-          <w:lang w:val="en-US"/>
-        </w:rPr>
-        <w:t xml:space="preserve"> </w:t>
-      </w:r>
-      <w:r>
-        <w:rPr>
-          <w:lang w:val="en-US"/>
-        </w:rPr>
-        <w:t>, s</w:t>
-      </w:r>
-      <w:r>
-        <w:rPr>
-          <w:rStyle w:val="CdigoHTML"/>
-          <w:b/>
-          <w:bCs/>
-          <w:lang w:val="en-US"/>
-        </w:rPr>
-        <w:t>tring Array Encoding</w:t>
-      </w:r>
-      <w:r>
-        <w:rPr>
-          <w:b/>
-          <w:bCs/>
-          <w:lang w:val="en-US"/>
-        </w:rPr>
-        <w:t>:</w:t>
-      </w:r>
-      <w:r>
-        <w:rPr>
-          <w:lang w:val="en-US"/>
-        </w:rPr>
-        <w:t xml:space="preserve"> </w:t>
-      </w:r>
-      <w:r>
-        <w:rPr>
-          <w:rStyle w:val="CdigoHTML"/>
-          <w:lang w:val="en-US"/>
-        </w:rPr>
-        <w:t>['</w:t>
-      </w:r>
-      <w:r>
-        <w:rPr>
-          <w:rStyle w:val="CdigoHTML"/>
-          <w:lang w:val="en-US"/>
-        </w:rPr>
-        <w:t>rc4</w:t>
-      </w:r>
-      <w:r>
-        <w:rPr>
-          <w:rStyle w:val="CdigoHTML"/>
-          <w:lang w:val="en-US"/>
-        </w:rPr>
-        <w:t>']</w:t>
-      </w:r>
-      <w:r>
-        <w:rPr>
-          <w:lang w:val="en-US"/>
-        </w:rPr>
-        <w:t xml:space="preserve"> </w:t>
-      </w:r>
-      <w:r>
-        <w:rPr>
-          <w:lang w:val="en-US"/>
-        </w:rPr>
-        <w:t xml:space="preserve">, </w:t>
-      </w:r>
-      <w:r>
-        <w:rPr>
-          <w:rStyle w:val="CdigoHTML"/>
-          <w:b/>
-          <w:bCs/>
-          <w:lang w:val="en-US"/>
-        </w:rPr>
-        <w:t>Control Flow Flattening</w:t>
-      </w:r>
-      <w:r>
-        <w:rPr>
-          <w:b/>
-          <w:bCs/>
-          <w:lang w:val="en-US"/>
-        </w:rPr>
-        <w:t>:</w:t>
-      </w:r>
-      <w:r>
-        <w:rPr>
-          <w:lang w:val="en-US"/>
-        </w:rPr>
-        <w:t xml:space="preserve"> </w:t>
-      </w:r>
-      <w:r>
-        <w:rPr>
-          <w:rStyle w:val="CdigoHTML"/>
-          <w:lang w:val="en-US"/>
-        </w:rPr>
-        <w:t>true</w:t>
-      </w:r>
-      <w:r>
-        <w:rPr>
-          <w:lang w:val="en-US"/>
-        </w:rPr>
-        <w:t xml:space="preserve"> </w:t>
-      </w:r>
-      <w:r>
-        <w:rPr>
-          <w:lang w:val="en-US"/>
-        </w:rPr>
-        <w:t>,</w:t>
-      </w:r>
-      <w:r>
-        <w:rPr>
-          <w:lang w:val="en-US"/>
-        </w:rPr>
-        <w:t xml:space="preserve">  </w:t>
-      </w:r>
-      <w:r>
-        <w:rPr>
-          <w:rStyle w:val="CdigoHTML"/>
-          <w:b/>
-          <w:bCs/>
-          <w:lang w:val="en-US"/>
-        </w:rPr>
-        <w:t xml:space="preserve">Rename </w:t>
-      </w:r>
-      <w:proofErr w:type="spellStart"/>
-      <w:r>
-        <w:rPr>
-          <w:rStyle w:val="CdigoHTML"/>
-          <w:b/>
-          <w:bCs/>
-          <w:lang w:val="en-US"/>
-        </w:rPr>
-        <w:t>Globals</w:t>
-      </w:r>
-      <w:proofErr w:type="spellEnd"/>
-      <w:r>
-        <w:rPr>
-          <w:b/>
-          <w:bCs/>
-          <w:lang w:val="en-US"/>
-        </w:rPr>
-        <w:t>:</w:t>
-      </w:r>
-      <w:r>
-        <w:rPr>
-          <w:lang w:val="en-US"/>
-        </w:rPr>
-        <w:t xml:space="preserve"> </w:t>
-      </w:r>
-      <w:r>
-        <w:rPr>
-          <w:rStyle w:val="CdigoHTML"/>
-          <w:lang w:val="en-US"/>
-        </w:rPr>
-        <w:t>true</w:t>
-      </w:r>
     </w:p>
-    <w:p>
-      <w:pPr>
-        <w:rPr>
-          <w:lang w:val="en-US"/>
-        </w:rPr>
-      </w:pPr>
-    </w:p>
-    <w:p>
-      <w:pPr>
-        <w:rPr>
-          <w:lang w:val="en-US"/>
-        </w:rPr>
-      </w:pPr>
-    </w:p>
-    <w:p>
-      <w:pPr>
-        <w:rPr>
-          <w:lang w:val="en-US"/>
-        </w:rPr>
-      </w:pPr>
-    </w:p>
+    <w:p/>
+    <w:p/>
+    <w:p/>
     <w:sectPr>
       <w:pgSz w:w="12240" w:h="15840"/>
       <w:pgMar w:top="1417" w:right="1701" w:bottom="1417" w:left="1701" w:header="720" w:footer="720" w:gutter="0"/>

</xml_diff>